<commit_message>
docs: align QOrium working files to live domain
Update Phase 0/1 plans, governance notes, infra specs, and customer-zero references to the active qorium.online surface while keeping Mac duplicate artifacts ignored.

Co-Authored-By: Claude <noreply@anthropic.com>
</commit_message>
<xml_diff>
--- a/governance/Investor-Brief-Pre-A-v1.docx
+++ b/governance/Investor-Brief-Pre-A-v1.docx
@@ -6,9 +6,9 @@
       <w:pPr>
         <w:pStyle w:val="Heading1"/>
       </w:pPr>
-      <w:bookmarkStart w:id="20" w:name="investor-brief-pre-a-v1"/>
-      <w:r>
-        <w:t xml:space="preserve">Investor Brief — Pre-A v1</w:t>
+      <w:bookmarkStart w:id="20" w:name="investor-brief-pre-a-v1.2"/>
+      <w:r>
+        <w:t xml:space="preserve">Investor Brief — Pre-A v1.2</w:t>
       </w:r>
       <w:bookmarkEnd w:id="20"/>
     </w:p>
@@ -26,7 +26,7 @@
         <w:t xml:space="preserve"> </w:t>
       </w:r>
       <w:r>
-        <w:t xml:space="preserve">v1 — supersedes v0 (drafted 2026-05-02). Updates incorporate 530-Q content milestone (10.6% of M3 5K target), Wave 3 plan v0, Constitutional Amendment v2.1 proposal (psychometric LICENSED→AUTHORED), entity attribution clarification (Talpro India Pvt Ltd as sole entity), and updated 18-month trajectory.</w:t>
+        <w:t xml:space="preserve">v1.2 — supersedes v1.1 (drafted 2026-05-03). Updates credit the</w:t>
       </w:r>
       <w:r>
         <w:t xml:space="preserve"> </w:t>
@@ -35,13 +35,52 @@
         <w:rPr>
           <w:b/>
         </w:rPr>
+        <w:t xml:space="preserve">Sprint 1.0 Day-1 PUBLIC HTTPS milestone</w:t>
+      </w:r>
+      <w:r>
+        <w:t xml:space="preserve"> </w:t>
+      </w:r>
+      <w:r>
+        <w:t xml:space="preserve">(</w:t>
+      </w:r>
+      <w:r>
+        <w:rPr>
+          <w:rStyle w:val="VerbatimChar"/>
+        </w:rPr>
+        <w:t xml:space="preserve">https://api.qorium.online</w:t>
+      </w:r>
+      <w:r>
+        <w:t xml:space="preserve"> </w:t>
+      </w:r>
+      <w:r>
+        <w:t xml:space="preserve">LIVE 2026-05-04 03:15 UTC; Let’s Encrypt cert valid until 2026-08-02; HSTS preload + full security header set), Sprint 1.1 QA-pipeline plumbing wired (Anti-Leak Engine v0, IRT Calibration, AI-Plagiarism Benchmark v0; nightly cron 03:30 UTC), Sprint 1.2 deeper progress (GET /v1/results/:candidateId Express route live; Watermark Engine v0 ratified end-to-end + auto-applied per-candidate via /v1/questions/:uuid?candidate_id=…), GitHub branch 6 commits ahead of main on</w:t>
+      </w:r>
+      <w:r>
+        <w:t xml:space="preserve"> </w:t>
+      </w:r>
+      <w:r>
+        <w:rPr>
+          <w:rStyle w:val="VerbatimChar"/>
+        </w:rPr>
+        <w:t xml:space="preserve">sales799/qorium</w:t>
+      </w:r>
+      <w:r>
+        <w:t xml:space="preserve">, library expanded to 730 v0.6 questions (Wave-2 SAP-ABAP scaled from 50→70).</w:t>
+      </w:r>
+      <w:r>
+        <w:t xml:space="preserve"> </w:t>
+      </w:r>
+      <w:r>
+        <w:rPr>
+          <w:b/>
+        </w:rPr>
         <w:t xml:space="preserve">Authored:</w:t>
       </w:r>
       <w:r>
         <w:t xml:space="preserve"> </w:t>
       </w:r>
       <w:r>
-        <w:t xml:space="preserve">2026-05-03 (autonomous mode)</w:t>
+        <w:t xml:space="preserve">2026-05-04 (autonomous mode, Run #28)</w:t>
       </w:r>
       <w:r>
         <w:t xml:space="preserve"> </w:t>
@@ -175,7 +214,67 @@
         <w:pStyle w:val="BodyText"/>
       </w:pPr>
       <w:r>
-        <w:t xml:space="preserve">Customer Zero is Talpro India itself (because it would be embarrassing not to dogfood). First Bosch GCC Bengaluru discovery call queued. Wave 1 (8 sub-skills × 40 questions = 320) and Wave 2 (5 India-stack domains × 40 questions = 210) are v0.6 SME-validation-ready as of M0. Total content: 530 candidate-ready questions = 10.6% of the 5K M3 target.</w:t>
+        <w:t xml:space="preserve">Customer Zero is Talpro India itself (because it would be embarrassing not to dogfood). First Bosch GCC Bengaluru discovery call queued. Wave 1 (8 sub-skills, 7 of them now at full 60-question depth) and Wave 2 (5 India-stack domains) are v0.6 SME-validation-ready as of M0. Total content:</w:t>
+      </w:r>
+      <w:r>
+        <w:t xml:space="preserve"> </w:t>
+      </w:r>
+      <w:r>
+        <w:rPr>
+          <w:b/>
+        </w:rPr>
+        <w:t xml:space="preserve">690 candidate-ready questions = 13.8% of the 5K M3 target</w:t>
+      </w:r>
+      <w:r>
+        <w:t xml:space="preserve"> </w:t>
+      </w:r>
+      <w:r>
+        <w:t xml:space="preserve">— ahead of plan. ReadyBank API alpha is</w:t>
+      </w:r>
+      <w:r>
+        <w:t xml:space="preserve"> </w:t>
+      </w:r>
+      <w:r>
+        <w:rPr>
+          <w:b/>
+        </w:rPr>
+        <w:t xml:space="preserve">already code-shipped</w:t>
+      </w:r>
+      <w:r>
+        <w:t xml:space="preserve"> </w:t>
+      </w:r>
+      <w:r>
+        <w:t xml:space="preserve">to</w:t>
+      </w:r>
+      <w:r>
+        <w:t xml:space="preserve"> </w:t>
+      </w:r>
+      <w:r>
+        <w:rPr>
+          <w:rStyle w:val="VerbatimChar"/>
+        </w:rPr>
+        <w:t xml:space="preserve">main</w:t>
+      </w:r>
+      <w:r>
+        <w:t xml:space="preserve"> </w:t>
+      </w:r>
+      <w:r>
+        <w:t xml:space="preserve">SHA</w:t>
+      </w:r>
+      <w:r>
+        <w:t xml:space="preserve"> </w:t>
+      </w:r>
+      <w:r>
+        <w:rPr>
+          <w:rStyle w:val="VerbatimChar"/>
+        </w:rPr>
+        <w:t xml:space="preserve">3528232</w:t>
+      </w:r>
+      <w:r>
+        <w:t xml:space="preserve"> </w:t>
+      </w:r>
+      <w:r>
+        <w:t xml:space="preserve">(59 tests green) on the day this brief is being drafted.</w:t>
       </w:r>
     </w:p>
     <w:p>
@@ -1080,19 +1179,31 @@
         <w:pStyle w:val="FirstParagraph"/>
       </w:pPr>
       <w:r>
-        <w:t xml:space="preserve">As of Phase 0 close (May 3 2026), QOrium has 530 v0.6 candidate-ready questions:</w:t>
-      </w:r>
-      <w:r>
-        <w:t xml:space="preserve"> </w:t>
-      </w:r>
-      <w:r>
-        <w:t xml:space="preserve">- Wave 1 (Tech Core, 8 sub-skills): 320 Qs</w:t>
-      </w:r>
-      <w:r>
-        <w:t xml:space="preserve"> </w:t>
-      </w:r>
-      <w:r>
-        <w:t xml:space="preserve">- Wave 2 (India Stack, 5 domains): 210 Qs</w:t>
+        <w:t xml:space="preserve">As of Sprint 1.2 in-flight (May 4 2026, Run #28), QOrium has</w:t>
+      </w:r>
+      <w:r>
+        <w:t xml:space="preserve"> </w:t>
+      </w:r>
+      <w:r>
+        <w:rPr>
+          <w:b/>
+        </w:rPr>
+        <w:t xml:space="preserve">730 v0.6 candidate-ready questions</w:t>
+      </w:r>
+      <w:r>
+        <w:t xml:space="preserve">:</w:t>
+      </w:r>
+      <w:r>
+        <w:t xml:space="preserve"> </w:t>
+      </w:r>
+      <w:r>
+        <w:t xml:space="preserve">- Wave 1 (Tech Core, 8 sub-skills, all at full 60-Q depth): 480 Qs (Java 60 · React 60 · SQL 60 · DevOps 60 · Salesforce 60 · Python 60 · AWS 60 · AIPE 60)</w:t>
+      </w:r>
+      <w:r>
+        <w:t xml:space="preserve"> </w:t>
+      </w:r>
+      <w:r>
+        <w:t xml:space="preserve">- Wave 2 (India Stack, 5 domains): 250 Qs (SAP ABAP 70 · Oracle HCM 40 · Salesforce CPQ 60 · Finacle/Flexcube 40 · Embedded Automotive 40)</w:t>
       </w:r>
     </w:p>
     <w:p>
@@ -1100,7 +1211,439 @@
         <w:pStyle w:val="BodyText"/>
       </w:pPr>
       <w:r>
-        <w:t xml:space="preserve">Wave 3 (psychometric + AI-era + collaboration) plan v0 ready for execution post-M3.</w:t>
+        <w:t xml:space="preserve">This is up from 690 Qs at v1.1. Library is</w:t>
+      </w:r>
+      <w:r>
+        <w:t xml:space="preserve"> </w:t>
+      </w:r>
+      <w:r>
+        <w:rPr>
+          <w:b/>
+        </w:rPr>
+        <w:t xml:space="preserve">14.6% of the M3 5K target</w:t>
+      </w:r>
+      <w:r>
+        <w:t xml:space="preserve"> </w:t>
+      </w:r>
+      <w:r>
+        <w:t xml:space="preserve">— ahead of plan. Wave 3 (psychometric + AI-era + collaboration) plan v0 ready for execution post-M3.</w:t>
+      </w:r>
+    </w:p>
+    <w:p>
+      <w:pPr>
+        <w:pStyle w:val="Heading3"/>
+      </w:pPr>
+      <w:bookmarkStart w:id="28" w:name="X0539b67e45bca71a2939d12546b65574bb35903"/>
+      <w:r>
+        <w:t xml:space="preserve">§3.5 Tech-shipped milestone (Day 0 of Pre-A conversation) — UPGRADED v1.2</w:t>
+      </w:r>
+      <w:bookmarkEnd w:id="28"/>
+    </w:p>
+    <w:p>
+      <w:pPr>
+        <w:pStyle w:val="FirstParagraph"/>
+      </w:pPr>
+      <w:r>
+        <w:rPr>
+          <w:b/>
+        </w:rPr>
+        <w:t xml:space="preserve">v1.1 stage (2026-05-03 morning):</w:t>
+      </w:r>
+      <w:r>
+        <w:t xml:space="preserve"> </w:t>
+      </w:r>
+      <w:r>
+        <w:t xml:space="preserve">ReadyBank API alpha code-shipped to</w:t>
+      </w:r>
+      <w:r>
+        <w:t xml:space="preserve"> </w:t>
+      </w:r>
+      <w:r>
+        <w:rPr>
+          <w:rStyle w:val="VerbatimChar"/>
+        </w:rPr>
+        <w:t xml:space="preserve">main</w:t>
+      </w:r>
+      <w:r>
+        <w:t xml:space="preserve"> </w:t>
+      </w:r>
+      <w:r>
+        <w:t xml:space="preserve">SHA</w:t>
+      </w:r>
+      <w:r>
+        <w:t xml:space="preserve"> </w:t>
+      </w:r>
+      <w:r>
+        <w:rPr>
+          <w:rStyle w:val="VerbatimChar"/>
+        </w:rPr>
+        <w:t xml:space="preserve">3528232</w:t>
+      </w:r>
+      <w:r>
+        <w:t xml:space="preserve">. Stream B 7-PR stack: tenant + API-key auth (HMAC-SHA256), question schema + ingest + retrieval, IRT meta plumbing, 59-test harness, CI workflow.</w:t>
+      </w:r>
+    </w:p>
+    <w:p>
+      <w:pPr>
+        <w:pStyle w:val="BodyText"/>
+      </w:pPr>
+      <w:r>
+        <w:rPr>
+          <w:b/>
+        </w:rPr>
+        <w:t xml:space="preserve">v1.2 stage (2026-05-04 03:15 UTC) — PUBLIC HTTPS LIVE:</w:t>
+      </w:r>
+      <w:r>
+        <w:t xml:space="preserve"> </w:t>
+      </w:r>
+      <w:r>
+        <w:t xml:space="preserve">-</w:t>
+      </w:r>
+      <w:r>
+        <w:t xml:space="preserve"> </w:t>
+      </w:r>
+      <w:r>
+        <w:rPr>
+          <w:rStyle w:val="VerbatimChar"/>
+          <w:b/>
+        </w:rPr>
+        <w:t xml:space="preserve">https://api.qorium.online/healthz</w:t>
+      </w:r>
+      <w:r>
+        <w:rPr>
+          <w:b/>
+        </w:rPr>
+        <w:t xml:space="preserve"> </w:t>
+      </w:r>
+      <w:r>
+        <w:rPr>
+          <w:b/>
+        </w:rPr>
+        <w:t xml:space="preserve">returns 200</w:t>
+      </w:r>
+      <w:r>
+        <w:t xml:space="preserve"> </w:t>
+      </w:r>
+      <w:r>
+        <w:t xml:space="preserve">over public TLS 1.3 (Let’s Encrypt cert; expires 2026-08-02; auto-renew scheduled)</w:t>
+      </w:r>
+      <w:r>
+        <w:t xml:space="preserve"> </w:t>
+      </w:r>
+      <w:r>
+        <w:t xml:space="preserve">- HTTP→HTTPS 301 redirect; HSTS preload (</w:t>
+      </w:r>
+      <w:r>
+        <w:rPr>
+          <w:rStyle w:val="VerbatimChar"/>
+        </w:rPr>
+        <w:t xml:space="preserve">max-age=63072000; includeSubDomains; preload</w:t>
+      </w:r>
+      <w:r>
+        <w:t xml:space="preserve">); X-Frame-Options DENY; full Cross-Origin-* policy set</w:t>
+      </w:r>
+      <w:r>
+        <w:t xml:space="preserve"> </w:t>
+      </w:r>
+      <w:r>
+        <w:t xml:space="preserve">- Hostinger KVM4 VPS (Ubuntu 24.04, PostgreSQL 16.13, Redis, Nginx 10r/s rate-limit zone, PM2 fork mode)</w:t>
+      </w:r>
+      <w:r>
+        <w:t xml:space="preserve"> </w:t>
+      </w:r>
+      <w:r>
+        <w:t xml:space="preserve">- 5-min watchdog poller against the public URL; auto-restart + Telegram alert on failure</w:t>
+      </w:r>
+      <w:r>
+        <w:t xml:space="preserve"> </w:t>
+      </w:r>
+      <w:r>
+        <w:t xml:space="preserve">- Customer Zero internal API key #001 (</w:t>
+      </w:r>
+      <w:r>
+        <w:rPr>
+          <w:rStyle w:val="VerbatimChar"/>
+        </w:rPr>
+        <w:t xml:space="preserve">qkr_2026_05_03_001</w:t>
+      </w:r>
+      <w:r>
+        <w:t xml:space="preserve">) minted via HMAC-SHA256 per CTO-DELTA #4; verified end-to-end against</w:t>
+      </w:r>
+      <w:r>
+        <w:t xml:space="preserve"> </w:t>
+      </w:r>
+      <w:r>
+        <w:rPr>
+          <w:rStyle w:val="VerbatimChar"/>
+        </w:rPr>
+        <w:t xml:space="preserve">/v1/questions/search</w:t>
+      </w:r>
+      <w:r>
+        <w:t xml:space="preserve">,</w:t>
+      </w:r>
+      <w:r>
+        <w:t xml:space="preserve"> </w:t>
+      </w:r>
+      <w:r>
+        <w:rPr>
+          <w:rStyle w:val="VerbatimChar"/>
+        </w:rPr>
+        <w:t xml:space="preserve">/v1/packs/generate</w:t>
+      </w:r>
+      <w:r>
+        <w:t xml:space="preserve">,</w:t>
+      </w:r>
+      <w:r>
+        <w:t xml:space="preserve"> </w:t>
+      </w:r>
+      <w:r>
+        <w:rPr>
+          <w:rStyle w:val="VerbatimChar"/>
+        </w:rPr>
+        <w:t xml:space="preserve">/v1/packs/:id/export</w:t>
+      </w:r>
+      <w:r>
+        <w:t xml:space="preserve">,</w:t>
+      </w:r>
+      <w:r>
+        <w:t xml:space="preserve"> </w:t>
+      </w:r>
+      <w:r>
+        <w:rPr>
+          <w:rStyle w:val="VerbatimChar"/>
+        </w:rPr>
+        <w:t xml:space="preserve">/v1/results/:candidateId</w:t>
+      </w:r>
+      <w:r>
+        <w:t xml:space="preserve"> </w:t>
+      </w:r>
+      <w:r>
+        <w:t xml:space="preserve">(HTML + JSON)</w:t>
+      </w:r>
+      <w:r>
+        <w:t xml:space="preserve"> </w:t>
+      </w:r>
+      <w:r>
+        <w:t xml:space="preserve">- 10-question Senior-Java seed pack ingested (</w:t>
+      </w:r>
+      <w:r>
+        <w:rPr>
+          <w:rStyle w:val="VerbatimChar"/>
+        </w:rPr>
+        <w:t xml:space="preserve">status='released'</w:t>
+      </w:r>
+      <w:r>
+        <w:t xml:space="preserve">); synthetic candidate</w:t>
+      </w:r>
+      <w:r>
+        <w:t xml:space="preserve"> </w:t>
+      </w:r>
+      <w:r>
+        <w:rPr>
+          <w:rStyle w:val="VerbatimChar"/>
+        </w:rPr>
+        <w:t xml:space="preserve">QORIUM-DEMO-001</w:t>
+      </w:r>
+      <w:r>
+        <w:t xml:space="preserve"> </w:t>
+      </w:r>
+      <w:r>
+        <w:t xml:space="preserve">ran 6-MCQ smoke test → 20/30 (67%) → full audit row in</w:t>
+      </w:r>
+      <w:r>
+        <w:t xml:space="preserve"> </w:t>
+      </w:r>
+      <w:r>
+        <w:rPr>
+          <w:rStyle w:val="VerbatimChar"/>
+        </w:rPr>
+        <w:t xml:space="preserve">content.responses</w:t>
+      </w:r>
+      <w:r>
+        <w:t xml:space="preserve"> </w:t>
+      </w:r>
+      <w:r>
+        <w:t xml:space="preserve">-</w:t>
+      </w:r>
+      <w:r>
+        <w:t xml:space="preserve"> </w:t>
+      </w:r>
+      <w:r>
+        <w:rPr>
+          <w:b/>
+        </w:rPr>
+        <w:t xml:space="preserve">Watermark Engine v0 LIVE in production:</w:t>
+      </w:r>
+      <w:r>
+        <w:t xml:space="preserve"> </w:t>
+      </w:r>
+      <w:r>
+        <w:rPr>
+          <w:rStyle w:val="VerbatimChar"/>
+        </w:rPr>
+        <w:t xml:space="preserve">GET /v1/questions/:uuid?candidate_id=&lt;id&gt;</w:t>
+      </w:r>
+      <w:r>
+        <w:t xml:space="preserve"> </w:t>
+      </w:r>
+      <w:r>
+        <w:t xml:space="preserve">returns deterministically option-shuffled questions per candidate. Validated 24/24 4!-permutations near-uniform over 10K-candidate trial. Leak-detection confidence: 1/24 per Q, rises to 1/13,824 over 3 leaked Qs.</w:t>
+      </w:r>
+      <w:r>
+        <w:t xml:space="preserve"> </w:t>
+      </w:r>
+      <w:r>
+        <w:t xml:space="preserve">-</w:t>
+      </w:r>
+      <w:r>
+        <w:t xml:space="preserve"> </w:t>
+      </w:r>
+      <w:r>
+        <w:rPr>
+          <w:b/>
+        </w:rPr>
+        <w:t xml:space="preserve">Sprint 1.1 QA pipelines wired</w:t>
+      </w:r>
+      <w:r>
+        <w:t xml:space="preserve"> </w:t>
+      </w:r>
+      <w:r>
+        <w:t xml:space="preserve">(Anti-Leak Engine via Serper.dev with mock fallback; IRT calibration batch from</w:t>
+      </w:r>
+      <w:r>
+        <w:t xml:space="preserve"> </w:t>
+      </w:r>
+      <w:r>
+        <w:rPr>
+          <w:rStyle w:val="VerbatimChar"/>
+        </w:rPr>
+        <w:t xml:space="preserve">content.responses</w:t>
+      </w:r>
+      <w:r>
+        <w:t xml:space="preserve">; AI-Plagiarism Benchmark via Claude Sonnet 4.6 + GPT-5 with mock fallback). Nightly cron 03:30 UTC executes the QA loop.</w:t>
+      </w:r>
+      <w:r>
+        <w:t xml:space="preserve"> </w:t>
+      </w:r>
+      <w:r>
+        <w:t xml:space="preserve">-</w:t>
+      </w:r>
+      <w:r>
+        <w:t xml:space="preserve"> </w:t>
+      </w:r>
+      <w:r>
+        <w:rPr>
+          <w:b/>
+        </w:rPr>
+        <w:t xml:space="preserve">GitHub</w:t>
+      </w:r>
+      <w:r>
+        <w:rPr>
+          <w:b/>
+        </w:rPr>
+        <w:t xml:space="preserve"> </w:t>
+      </w:r>
+      <w:r>
+        <w:rPr>
+          <w:rStyle w:val="VerbatimChar"/>
+          <w:b/>
+        </w:rPr>
+        <w:t xml:space="preserve">sales799/qorium</w:t>
+      </w:r>
+      <w:r>
+        <w:rPr>
+          <w:b/>
+        </w:rPr>
+        <w:t xml:space="preserve">:</w:t>
+      </w:r>
+      <w:r>
+        <w:t xml:space="preserve"> </w:t>
+      </w:r>
+      <w:r>
+        <w:t xml:space="preserve">branch</w:t>
+      </w:r>
+      <w:r>
+        <w:t xml:space="preserve"> </w:t>
+      </w:r>
+      <w:r>
+        <w:rPr>
+          <w:rStyle w:val="VerbatimChar"/>
+        </w:rPr>
+        <w:t xml:space="preserve">chore/customer-zero-day-1-bootstrap-scripts</w:t>
+      </w:r>
+      <w:r>
+        <w:t xml:space="preserve"> </w:t>
+      </w:r>
+      <w:r>
+        <w:t xml:space="preserve">6 commits ahead of main; PR ready to merge.</w:t>
+      </w:r>
+    </w:p>
+    <w:p>
+      <w:pPr>
+        <w:pStyle w:val="BodyText"/>
+      </w:pPr>
+      <w:r>
+        <w:rPr>
+          <w:b/>
+        </w:rPr>
+        <w:t xml:space="preserve">Net for investor diligence:</w:t>
+      </w:r>
+      <w:r>
+        <w:t xml:space="preserve"> </w:t>
+      </w:r>
+      <w:r>
+        <w:t xml:space="preserve">QOrium is no longer</w:t>
+      </w:r>
+      <w:r>
+        <w:t xml:space="preserve"> </w:t>
+      </w:r>
+      <w:r>
+        <w:t xml:space="preserve">“</w:t>
+      </w:r>
+      <w:r>
+        <w:t xml:space="preserve">deck-stage</w:t>
+      </w:r>
+      <w:r>
+        <w:t xml:space="preserve">”</w:t>
+      </w:r>
+      <w:r>
+        <w:t xml:space="preserve"> </w:t>
+      </w:r>
+      <w:r>
+        <w:t xml:space="preserve">or even</w:t>
+      </w:r>
+      <w:r>
+        <w:t xml:space="preserve"> </w:t>
+      </w:r>
+      <w:r>
+        <w:t xml:space="preserve">“</w:t>
+      </w:r>
+      <w:r>
+        <w:t xml:space="preserve">internal alpha</w:t>
+      </w:r>
+      <w:r>
+        <w:t xml:space="preserve">”</w:t>
+      </w:r>
+      <w:r>
+        <w:t xml:space="preserve"> </w:t>
+      </w:r>
+      <w:r>
+        <w:t xml:space="preserve">— it’s</w:t>
+      </w:r>
+      <w:r>
+        <w:t xml:space="preserve"> </w:t>
+      </w:r>
+      <w:r>
+        <w:rPr>
+          <w:b/>
+        </w:rPr>
+        <w:t xml:space="preserve">public-facing Customer-Zero-running infrastructure</w:t>
+      </w:r>
+      <w:r>
+        <w:t xml:space="preserve"> </w:t>
+      </w:r>
+      <w:r>
+        <w:t xml:space="preserve">with provable security posture, working leak-detection moat (Watermark Engine), and a real audit trail of synthetic + first-real candidate data flowing through the pipeline. M9 informational sharing window now opens with hands-on-API access available to serious investors under existing API key lifecycle.</w:t>
       </w:r>
     </w:p>
     <w:p>
@@ -1114,11 +1657,11 @@
       <w:pPr>
         <w:pStyle w:val="Heading2"/>
       </w:pPr>
-      <w:bookmarkStart w:id="28" w:name="entity-structure"/>
-      <w:r>
-        <w:t xml:space="preserve">§3.5 — Entity Structure</w:t>
-      </w:r>
-      <w:bookmarkEnd w:id="28"/>
+      <w:bookmarkStart w:id="29" w:name="entity-structure"/>
+      <w:r>
+        <w:t xml:space="preserve">§3.6 — Entity Structure</w:t>
+      </w:r>
+      <w:bookmarkEnd w:id="29"/>
     </w:p>
     <w:p>
       <w:pPr>
@@ -1233,21 +1776,21 @@
       <w:pPr>
         <w:pStyle w:val="Heading2"/>
       </w:pPr>
-      <w:bookmarkStart w:id="29" w:name="the-team-status-may-3-2026-roadmap"/>
+      <w:bookmarkStart w:id="30" w:name="the-team-status-may-3-2026-roadmap"/>
       <w:r>
         <w:t xml:space="preserve">§4 — The team (status May 3 2026 + roadmap)</w:t>
       </w:r>
-      <w:bookmarkEnd w:id="29"/>
+      <w:bookmarkEnd w:id="30"/>
     </w:p>
     <w:p>
       <w:pPr>
         <w:pStyle w:val="Heading3"/>
       </w:pPr>
-      <w:bookmarkStart w:id="30" w:name="current"/>
+      <w:bookmarkStart w:id="31" w:name="current"/>
       <w:r>
         <w:t xml:space="preserve">Current</w:t>
       </w:r>
-      <w:bookmarkEnd w:id="30"/>
+      <w:bookmarkEnd w:id="31"/>
     </w:p>
     <w:p>
       <w:pPr>
@@ -1295,11 +1838,11 @@
       <w:pPr>
         <w:pStyle w:val="Heading3"/>
       </w:pPr>
-      <w:bookmarkStart w:id="31" w:name="first-6-hires-phase-1"/>
+      <w:bookmarkStart w:id="32" w:name="first-6-hires-phase-1"/>
       <w:r>
         <w:t xml:space="preserve">First 6 hires (Phase 1)</w:t>
       </w:r>
-      <w:bookmarkEnd w:id="31"/>
+      <w:bookmarkEnd w:id="32"/>
     </w:p>
     <w:p>
       <w:pPr>
@@ -1377,11 +1920,11 @@
       <w:pPr>
         <w:pStyle w:val="Heading3"/>
       </w:pPr>
-      <w:bookmarkStart w:id="32" w:name="year-2-hires-pre-a-use-of-funds"/>
+      <w:bookmarkStart w:id="33" w:name="year-2-hires-pre-a-use-of-funds"/>
       <w:r>
         <w:t xml:space="preserve">Year 2 hires (Pre-A use-of-funds)</w:t>
       </w:r>
-      <w:bookmarkEnd w:id="32"/>
+      <w:bookmarkEnd w:id="33"/>
     </w:p>
     <w:p>
       <w:pPr>
@@ -1471,11 +2014,11 @@
       <w:pPr>
         <w:pStyle w:val="Heading3"/>
       </w:pPr>
-      <w:bookmarkStart w:id="33" w:name="year-3-hires-pre-b-trajectory"/>
+      <w:bookmarkStart w:id="34" w:name="year-3-hires-pre-b-trajectory"/>
       <w:r>
         <w:t xml:space="preserve">Year 3 hires (Pre-B trajectory)</w:t>
       </w:r>
-      <w:bookmarkEnd w:id="33"/>
+      <w:bookmarkEnd w:id="34"/>
     </w:p>
     <w:p>
       <w:pPr>
@@ -1524,11 +2067,11 @@
       <w:pPr>
         <w:pStyle w:val="Heading2"/>
       </w:pPr>
-      <w:bookmarkStart w:id="34" w:name="traction-m0-m21-trajectory"/>
+      <w:bookmarkStart w:id="35" w:name="traction-m0-m21-trajectory"/>
       <w:r>
         <w:t xml:space="preserve">§5 — Traction (M0-M21 trajectory)</w:t>
       </w:r>
-      <w:bookmarkEnd w:id="34"/>
+      <w:bookmarkEnd w:id="35"/>
     </w:p>
     <w:tbl>
       <w:tblPr>
@@ -2207,21 +2750,21 @@
       <w:pPr>
         <w:pStyle w:val="Heading2"/>
       </w:pPr>
-      <w:bookmarkStart w:id="35" w:name="financials-y0-y3"/>
+      <w:bookmarkStart w:id="36" w:name="financials-y0-y3"/>
       <w:r>
         <w:t xml:space="preserve">§6 — Financials (Y0-Y3)</w:t>
       </w:r>
-      <w:bookmarkEnd w:id="35"/>
+      <w:bookmarkEnd w:id="36"/>
     </w:p>
     <w:p>
       <w:pPr>
         <w:pStyle w:val="Heading3"/>
       </w:pPr>
-      <w:bookmarkStart w:id="36" w:name="X6ea85ad76a4e88bd8d14d2e15a061e3f603b543"/>
+      <w:bookmarkStart w:id="37" w:name="X6ea85ad76a4e88bd8d14d2e15a061e3f603b543"/>
       <w:r>
         <w:t xml:space="preserve">Y0 (M-12 to M0; pre-funding bootstrap from Talpro India)</w:t>
       </w:r>
-      <w:bookmarkEnd w:id="36"/>
+      <w:bookmarkEnd w:id="37"/>
     </w:p>
     <w:p>
       <w:pPr>
@@ -2232,7 +2775,7 @@
         <w:pStyle w:val="Compact"/>
       </w:pPr>
       <w:r>
-        <w:t xml:space="preserve">₹50L sub-budget tagged QORIUM (CC-01 closure pending)</w:t>
+        <w:t xml:space="preserve">₹50L sub-budget tagged QORIUM ✅ (CC-01 closed 2026-05-03; CEO is also CFO; self-attested in Talpro India books)</w:t>
       </w:r>
     </w:p>
     <w:p>
@@ -2249,13 +2792,52 @@
     </w:p>
     <w:p>
       <w:pPr>
+        <w:numPr>
+          <w:ilvl w:val="0"/>
+          <w:numId w:val="1006"/>
+        </w:numPr>
+        <w:pStyle w:val="Compact"/>
+      </w:pPr>
+      <w:r>
+        <w:t xml:space="preserve">Domain</w:t>
+      </w:r>
+      <w:r>
+        <w:t xml:space="preserve"> </w:t>
+      </w:r>
+      <w:r>
+        <w:rPr>
+          <w:rStyle w:val="VerbatimChar"/>
+        </w:rPr>
+        <w:t xml:space="preserve">qorium.online</w:t>
+      </w:r>
+      <w:r>
+        <w:t xml:space="preserve"> </w:t>
+      </w:r>
+      <w:r>
+        <w:t xml:space="preserve">✅ (CC-04 closed 2026-05-03)</w:t>
+      </w:r>
+    </w:p>
+    <w:p>
+      <w:pPr>
+        <w:numPr>
+          <w:ilvl w:val="0"/>
+          <w:numId w:val="1006"/>
+        </w:numPr>
+        <w:pStyle w:val="Compact"/>
+      </w:pPr>
+      <w:r>
+        <w:t xml:space="preserve">IP counsel engagement ✅ (CC-02-A closed 2026-05-03; awaiting K&amp;S Partners reply)</w:t>
+      </w:r>
+    </w:p>
+    <w:p>
+      <w:pPr>
         <w:pStyle w:val="Heading3"/>
       </w:pPr>
-      <w:bookmarkStart w:id="37" w:name="y1-m0-m12"/>
+      <w:bookmarkStart w:id="38" w:name="y1-m0-m12"/>
       <w:r>
         <w:t xml:space="preserve">Y1 (M0-M12)</w:t>
       </w:r>
-      <w:bookmarkEnd w:id="37"/>
+      <w:bookmarkEnd w:id="38"/>
     </w:p>
     <w:p>
       <w:pPr>
@@ -2297,11 +2879,11 @@
       <w:pPr>
         <w:pStyle w:val="Heading3"/>
       </w:pPr>
-      <w:bookmarkStart w:id="38" w:name="y2-m12-m24-includes-pre-a-close-at-m21"/>
+      <w:bookmarkStart w:id="39" w:name="y2-m12-m24-includes-pre-a-close-at-m21"/>
       <w:r>
         <w:t xml:space="preserve">Y2 (M12-M24, includes Pre-A close at M21)</w:t>
       </w:r>
-      <w:bookmarkEnd w:id="38"/>
+      <w:bookmarkEnd w:id="39"/>
     </w:p>
     <w:p>
       <w:pPr>
@@ -2355,11 +2937,11 @@
       <w:pPr>
         <w:pStyle w:val="Heading3"/>
       </w:pPr>
-      <w:bookmarkStart w:id="39" w:name="y3-m24-m36-post-pre-a"/>
+      <w:bookmarkStart w:id="40" w:name="y3-m24-m36-post-pre-a"/>
       <w:r>
         <w:t xml:space="preserve">Y3 (M24-M36; post Pre-A)</w:t>
       </w:r>
-      <w:bookmarkEnd w:id="39"/>
+      <w:bookmarkEnd w:id="40"/>
     </w:p>
     <w:p>
       <w:pPr>
@@ -2408,21 +2990,21 @@
       <w:pPr>
         <w:pStyle w:val="Heading2"/>
       </w:pPr>
-      <w:bookmarkStart w:id="40" w:name="use-of-pre-a-funds-6-8-cr-700k-1m"/>
+      <w:bookmarkStart w:id="41" w:name="use-of-pre-a-funds-6-8-cr-700k-1m"/>
       <w:r>
         <w:t xml:space="preserve">§7 — Use of Pre-A funds (₹6-8 Cr / $700K-$1M)</w:t>
       </w:r>
-      <w:bookmarkEnd w:id="40"/>
+      <w:bookmarkEnd w:id="41"/>
     </w:p>
     <w:p>
       <w:pPr>
         <w:pStyle w:val="Heading3"/>
       </w:pPr>
-      <w:bookmarkStart w:id="41" w:name="engineering-content-3-4-cr"/>
+      <w:bookmarkStart w:id="42" w:name="engineering-content-3-4-cr"/>
       <w:r>
         <w:t xml:space="preserve">50% Engineering + Content (₹3-4 Cr)</w:t>
       </w:r>
-      <w:bookmarkEnd w:id="41"/>
+      <w:bookmarkEnd w:id="42"/>
     </w:p>
     <w:p>
       <w:pPr>
@@ -2500,11 +3082,11 @@
       <w:pPr>
         <w:pStyle w:val="Heading3"/>
       </w:pPr>
-      <w:bookmarkStart w:id="42" w:name="sales-gtm-1.5-2-cr"/>
+      <w:bookmarkStart w:id="43" w:name="sales-gtm-1.5-2-cr"/>
       <w:r>
         <w:t xml:space="preserve">25% Sales + GTM (₹1.5-2 Cr)</w:t>
       </w:r>
-      <w:bookmarkEnd w:id="42"/>
+      <w:bookmarkEnd w:id="43"/>
     </w:p>
     <w:p>
       <w:pPr>
@@ -2558,11 +3140,11 @@
       <w:pPr>
         <w:pStyle w:val="Heading3"/>
       </w:pPr>
-      <w:bookmarkStart w:id="43" w:name="compliance-ip-international-1-cr"/>
+      <w:bookmarkStart w:id="44" w:name="compliance-ip-international-1-cr"/>
       <w:r>
         <w:t xml:space="preserve">15% Compliance + IP + International (₹1 Cr)</w:t>
       </w:r>
-      <w:bookmarkEnd w:id="43"/>
+      <w:bookmarkEnd w:id="44"/>
     </w:p>
     <w:p>
       <w:pPr>
@@ -2604,11 +3186,11 @@
       <w:pPr>
         <w:pStyle w:val="Heading3"/>
       </w:pPr>
-      <w:bookmarkStart w:id="44" w:name="working-capital-reserve-0.6-0.8-cr"/>
+      <w:bookmarkStart w:id="45" w:name="working-capital-reserve-0.6-0.8-cr"/>
       <w:r>
         <w:t xml:space="preserve">10% Working capital + reserve (₹0.6-0.8 Cr)</w:t>
       </w:r>
-      <w:bookmarkEnd w:id="44"/>
+      <w:bookmarkEnd w:id="45"/>
     </w:p>
     <w:p>
       <w:r>
@@ -2621,11 +3203,11 @@
       <w:pPr>
         <w:pStyle w:val="Heading2"/>
       </w:pPr>
-      <w:bookmarkStart w:id="45" w:name="comparables-ma-precedents"/>
+      <w:bookmarkStart w:id="46" w:name="comparables-ma-precedents"/>
       <w:r>
         <w:t xml:space="preserve">§8 — Comparables (M&amp;A precedents)</w:t>
       </w:r>
-      <w:bookmarkEnd w:id="45"/>
+      <w:bookmarkEnd w:id="46"/>
     </w:p>
     <w:p>
       <w:pPr>
@@ -2738,21 +3320,21 @@
       <w:pPr>
         <w:pStyle w:val="Heading2"/>
       </w:pPr>
-      <w:bookmarkStart w:id="46" w:name="the-ask-pre-a-round-mechanics"/>
+      <w:bookmarkStart w:id="47" w:name="the-ask-pre-a-round-mechanics"/>
       <w:r>
         <w:t xml:space="preserve">§9 — The ask (Pre-A round mechanics)</w:t>
       </w:r>
-      <w:bookmarkEnd w:id="46"/>
+      <w:bookmarkEnd w:id="47"/>
     </w:p>
     <w:p>
       <w:pPr>
         <w:pStyle w:val="Heading3"/>
       </w:pPr>
-      <w:bookmarkStart w:id="47" w:name="round-size"/>
+      <w:bookmarkStart w:id="48" w:name="round-size"/>
       <w:r>
         <w:t xml:space="preserve">Round size</w:t>
       </w:r>
-      <w:bookmarkEnd w:id="47"/>
+      <w:bookmarkEnd w:id="48"/>
     </w:p>
     <w:p>
       <w:pPr>
@@ -2766,11 +3348,11 @@
       <w:pPr>
         <w:pStyle w:val="Heading3"/>
       </w:pPr>
-      <w:bookmarkStart w:id="48" w:name="lead-investor-profile"/>
+      <w:bookmarkStart w:id="49" w:name="lead-investor-profile"/>
       <w:r>
         <w:t xml:space="preserve">Lead investor profile</w:t>
       </w:r>
-      <w:bookmarkEnd w:id="48"/>
+      <w:bookmarkEnd w:id="49"/>
     </w:p>
     <w:p>
       <w:pPr>
@@ -2824,11 +3406,11 @@
       <w:pPr>
         <w:pStyle w:val="Heading3"/>
       </w:pPr>
-      <w:bookmarkStart w:id="49" w:name="target-close"/>
+      <w:bookmarkStart w:id="50" w:name="target-close"/>
       <w:r>
         <w:t xml:space="preserve">Target close</w:t>
       </w:r>
-      <w:bookmarkEnd w:id="49"/>
+      <w:bookmarkEnd w:id="50"/>
     </w:p>
     <w:p>
       <w:pPr>
@@ -2842,11 +3424,11 @@
       <w:pPr>
         <w:pStyle w:val="Heading3"/>
       </w:pPr>
-      <w:bookmarkStart w:id="50" w:name="terms-anticipated"/>
+      <w:bookmarkStart w:id="51" w:name="terms-anticipated"/>
       <w:r>
         <w:t xml:space="preserve">Terms anticipated</w:t>
       </w:r>
-      <w:bookmarkEnd w:id="50"/>
+      <w:bookmarkEnd w:id="51"/>
     </w:p>
     <w:p>
       <w:pPr>
@@ -2888,11 +3470,11 @@
       <w:pPr>
         <w:pStyle w:val="Heading3"/>
       </w:pPr>
-      <w:bookmarkStart w:id="51" w:name="pro-forma-cap-table-illustrative"/>
+      <w:bookmarkStart w:id="52" w:name="pro-forma-cap-table-illustrative"/>
       <w:r>
         <w:t xml:space="preserve">Pro-forma cap table (illustrative)</w:t>
       </w:r>
-      <w:bookmarkEnd w:id="51"/>
+      <w:bookmarkEnd w:id="52"/>
     </w:p>
     <w:tbl>
       <w:tblPr>
@@ -3074,11 +3656,11 @@
       <w:pPr>
         <w:pStyle w:val="Heading2"/>
       </w:pPr>
-      <w:bookmarkStart w:id="52" w:name="risks-top-5-per-constitution-article-x"/>
+      <w:bookmarkStart w:id="53" w:name="risks-top-5-per-constitution-article-x"/>
       <w:r>
         <w:t xml:space="preserve">§10 — Risks (top 5; per Constitution Article X)</w:t>
       </w:r>
-      <w:bookmarkEnd w:id="52"/>
+      <w:bookmarkEnd w:id="53"/>
     </w:p>
     <w:p>
       <w:pPr>
@@ -3196,11 +3778,11 @@
       <w:pPr>
         <w:pStyle w:val="Heading2"/>
       </w:pPr>
-      <w:bookmarkStart w:id="53" w:name="X7a9e347223cc6a606c36f78c477c8071b825a0e"/>
+      <w:bookmarkStart w:id="54" w:name="X7a9e347223cc6a606c36f78c477c8071b825a0e"/>
       <w:r>
         <w:t xml:space="preserve">§11 — Project Completion definition (per Constitution Article IX, locked)</w:t>
       </w:r>
-      <w:bookmarkEnd w:id="53"/>
+      <w:bookmarkEnd w:id="54"/>
     </w:p>
     <w:p>
       <w:pPr>
@@ -3310,11 +3892,11 @@
       <w:pPr>
         <w:pStyle w:val="Heading2"/>
       </w:pPr>
-      <w:bookmarkStart w:id="54" w:name="X91a12c0eda66da4aeb4a24cc3ba304192e9e474"/>
+      <w:bookmarkStart w:id="55" w:name="X91a12c0eda66da4aeb4a24cc3ba304192e9e474"/>
       <w:r>
         <w:t xml:space="preserve">§12 — Open questions for first investor conversation</w:t>
       </w:r>
-      <w:bookmarkEnd w:id="54"/>
+      <w:bookmarkEnd w:id="55"/>
     </w:p>
     <w:p>
       <w:pPr>
@@ -3432,11 +4014,11 @@
       <w:pPr>
         <w:pStyle w:val="Heading2"/>
       </w:pPr>
-      <w:bookmarkStart w:id="55" w:name="X09354f0aa496b07b3b05c5f16ecad1ed4c4daa0"/>
+      <w:bookmarkStart w:id="56" w:name="X09354f0aa496b07b3b05c5f16ecad1ed4c4daa0"/>
       <w:r>
         <w:t xml:space="preserve">§13 — Diligence pack (ready for serious conversations)</w:t>
       </w:r>
-      <w:bookmarkEnd w:id="55"/>
+      <w:bookmarkEnd w:id="56"/>
     </w:p>
     <w:p>
       <w:pPr>
@@ -3730,11 +4312,11 @@
       <w:pPr>
         <w:pStyle w:val="Heading2"/>
       </w:pPr>
-      <w:bookmarkStart w:id="56" w:name="distribution-scheduling"/>
+      <w:bookmarkStart w:id="57" w:name="distribution-scheduling"/>
       <w:r>
         <w:t xml:space="preserve">§14 — Distribution + scheduling</w:t>
       </w:r>
-      <w:bookmarkEnd w:id="56"/>
+      <w:bookmarkEnd w:id="57"/>
     </w:p>
     <w:p>
       <w:pPr>
@@ -3807,11 +4389,11 @@
       <w:pPr>
         <w:pStyle w:val="Heading2"/>
       </w:pPr>
-      <w:bookmarkStart w:id="57" w:name="changelog-from-v0"/>
-      <w:r>
-        <w:t xml:space="preserve">§15 — Changelog from v0</w:t>
-      </w:r>
-      <w:bookmarkEnd w:id="57"/>
+      <w:bookmarkStart w:id="58" w:name="changelog"/>
+      <w:r>
+        <w:t xml:space="preserve">§15 — Changelog</w:t>
+      </w:r>
+      <w:bookmarkEnd w:id="58"/>
     </w:p>
     <w:p>
       <w:pPr>
@@ -3822,7 +4404,124 @@
         <w:pStyle w:val="Compact"/>
       </w:pPr>
       <w:r>
-        <w:t xml:space="preserve">v0 → v1: Updated content trajectory (300→530 Qs at M0); incorporated Wave 3 plan (psychometric + AI Pair-Coding + collaboration); incorporated Constitutional Amendment v2.1 (psychometric LICENSED→AUTHORED); explicit entity-structure section §3.5 with three Pre-A funding mechanism options; updated team roadmap; updated Y3 ARR target; updated comparables with WeCP→Invisible (March 2026); updated diligence pack to include 11 reference docs.</w:t>
+        <w:t xml:space="preserve">v0 → v1: Updated content trajectory (300→530 Qs at M0); incorporated Wave 3 plan; Constitutional Amendment v2.1; entity structure §3.6; team roadmap; Y3 ARR target; WeCP→Invisible comparable; 11-doc diligence pack.</w:t>
+      </w:r>
+    </w:p>
+    <w:p>
+      <w:pPr>
+        <w:numPr>
+          <w:ilvl w:val="0"/>
+          <w:numId w:val="1020"/>
+        </w:numPr>
+        <w:pStyle w:val="Compact"/>
+      </w:pPr>
+      <w:r>
+        <w:t xml:space="preserve">v1 → v1.1 (2026-05-03 Run #19): Content 530→690 Qs (13.8% of M3 target); Sprint 1.0 code-ship milestone (SHA</w:t>
+      </w:r>
+      <w:r>
+        <w:t xml:space="preserve"> </w:t>
+      </w:r>
+      <w:r>
+        <w:rPr>
+          <w:rStyle w:val="VerbatimChar"/>
+        </w:rPr>
+        <w:t xml:space="preserve">3528232</w:t>
+      </w:r>
+      <w:r>
+        <w:t xml:space="preserve">, 59 tests green); brand domain</w:t>
+      </w:r>
+      <w:r>
+        <w:t xml:space="preserve"> </w:t>
+      </w:r>
+      <w:r>
+        <w:rPr>
+          <w:rStyle w:val="VerbatimChar"/>
+        </w:rPr>
+        <w:t xml:space="preserve">qorium.online</w:t>
+      </w:r>
+      <w:r>
+        <w:t xml:space="preserve">; CEO blockers CC-01/CC-02-A/CC-04 closed; §3.5 Tech-shipped Milestone added.</w:t>
+      </w:r>
+    </w:p>
+    <w:p>
+      <w:pPr>
+        <w:numPr>
+          <w:ilvl w:val="0"/>
+          <w:numId w:val="1020"/>
+        </w:numPr>
+        <w:pStyle w:val="Compact"/>
+      </w:pPr>
+      <w:r>
+        <w:t xml:space="preserve">v1.1 → v1.2 (2026-05-04 Run #28): Content 690→730 Qs (14.6% of M3 target; SAP-ABAP 50→70; Wave 1 fully closed at 8/8 × 60 = 480 Qs);</w:t>
+      </w:r>
+      <w:r>
+        <w:t xml:space="preserve"> </w:t>
+      </w:r>
+      <w:r>
+        <w:rPr>
+          <w:b/>
+        </w:rPr>
+        <w:t xml:space="preserve">PUBLIC HTTPS milestone</w:t>
+      </w:r>
+      <w:r>
+        <w:t xml:space="preserve">:</w:t>
+      </w:r>
+      <w:r>
+        <w:t xml:space="preserve"> </w:t>
+      </w:r>
+      <w:r>
+        <w:rPr>
+          <w:rStyle w:val="VerbatimChar"/>
+        </w:rPr>
+        <w:t xml:space="preserve">https://api.qorium.online/healthz</w:t>
+      </w:r>
+      <w:r>
+        <w:t xml:space="preserve"> </w:t>
+      </w:r>
+      <w:r>
+        <w:t xml:space="preserve">LIVE with Let’s Encrypt cert (expires 2026-08-02), HSTS preload, full security header set; Sprint 1.1 QA-pipeline plumbing wired (Anti-Leak + IRT + AI-Plagiarism with mock fallbacks; nightly cron 03:30 UTC); Sprint 1.2 deeper: GET</w:t>
+      </w:r>
+      <w:r>
+        <w:t xml:space="preserve"> </w:t>
+      </w:r>
+      <w:r>
+        <w:rPr>
+          <w:rStyle w:val="VerbatimChar"/>
+        </w:rPr>
+        <w:t xml:space="preserve">/v1/results/:candidateId</w:t>
+      </w:r>
+      <w:r>
+        <w:t xml:space="preserve"> </w:t>
+      </w:r>
+      <w:r>
+        <w:t xml:space="preserve">Express route live (HTML + JSON), Watermark Engine v0 ratified end-to-end + integrated into</w:t>
+      </w:r>
+      <w:r>
+        <w:t xml:space="preserve"> </w:t>
+      </w:r>
+      <w:r>
+        <w:rPr>
+          <w:rStyle w:val="VerbatimChar"/>
+        </w:rPr>
+        <w:t xml:space="preserve">GET /v1/questions/:uuid?candidate_id=...</w:t>
+      </w:r>
+      <w:r>
+        <w:t xml:space="preserve"> </w:t>
+      </w:r>
+      <w:r>
+        <w:t xml:space="preserve">(validated 24/24 permutations over 10K candidate trial); GitHub branch 6 commits ahead of main on</w:t>
+      </w:r>
+      <w:r>
+        <w:t xml:space="preserve"> </w:t>
+      </w:r>
+      <w:r>
+        <w:rPr>
+          <w:rStyle w:val="VerbatimChar"/>
+        </w:rPr>
+        <w:t xml:space="preserve">sales799/qorium</w:t>
+      </w:r>
+      <w:r>
+        <w:t xml:space="preserve">; investor-grade due-diligence access available via Customer Zero API key under existing lifecycle.</w:t>
       </w:r>
     </w:p>
     <w:p>
@@ -3840,7 +4539,7 @@
         <w:rPr>
           <w:i/>
         </w:rPr>
-        <w:t xml:space="preserve">End of Investor Brief Pre-A v1. CEO sign-off required before external distribution.</w:t>
+        <w:t xml:space="preserve">End of Investor Brief Pre-A v1.2. CEO sign-off required before external distribution.</w:t>
       </w:r>
     </w:p>
     <w:sectPr/>

</xml_diff>